<commit_message>
stake holder contract foundation
</commit_message>
<xml_diff>
--- a/docs/Project Overview.docx
+++ b/docs/Project Overview.docx
@@ -4,6 +4,9 @@
   <w:body>
     <w:p>
       <w:r>
+        <w:t>a</w:t>
+      </w:r>
+      <w:r>
         <w:t xml:space="preserve">The assignment for each group is to prepare a slide presentation of 7 slides with the following content on each slide: </w:t>
       </w:r>
     </w:p>
@@ -231,7 +234,7 @@
     <w:p>
       <w:r>
         <w:pict w14:anchorId="416D966F">
-          <v:rect id="_x0000_i1163" style="width:0;height:1.5pt" o:hralign="center" o:hrstd="t" o:hr="t" fillcolor="#a0a0a0" stroked="f"/>
+          <v:rect id="_x0000_i1025" style="width:0;height:1.5pt" o:hralign="center" o:hrstd="t" o:hr="t" fillcolor="#a0a0a0" stroked="f"/>
         </w:pict>
       </w:r>
     </w:p>
@@ -386,7 +389,7 @@
     <w:p>
       <w:r>
         <w:pict w14:anchorId="2430F179">
-          <v:rect id="_x0000_i1164" style="width:0;height:1.5pt" o:hralign="center" o:hrstd="t" o:hr="t" fillcolor="#a0a0a0" stroked="f"/>
+          <v:rect id="_x0000_i1026" style="width:0;height:1.5pt" o:hralign="center" o:hrstd="t" o:hr="t" fillcolor="#a0a0a0" stroked="f"/>
         </w:pict>
       </w:r>
     </w:p>
@@ -547,7 +550,7 @@
     <w:p>
       <w:r>
         <w:pict w14:anchorId="04AC7DEF">
-          <v:rect id="_x0000_i1165" style="width:0;height:1.5pt" o:hralign="center" o:hrstd="t" o:hr="t" fillcolor="#a0a0a0" stroked="f"/>
+          <v:rect id="_x0000_i1027" style="width:0;height:1.5pt" o:hralign="center" o:hrstd="t" o:hr="t" fillcolor="#a0a0a0" stroked="f"/>
         </w:pict>
       </w:r>
     </w:p>
@@ -597,8 +600,13 @@
       </w:r>
       <w:proofErr w:type="spellEnd"/>
       <w:r>
-        <w:t>));</w:t>
-      </w:r>
+        <w:t>)</w:t>
+      </w:r>
+      <w:proofErr w:type="gramStart"/>
+      <w:r>
+        <w:t>);</w:t>
+      </w:r>
+      <w:proofErr w:type="gramEnd"/>
     </w:p>
     <w:p>
       <w:r>
@@ -618,8 +626,13 @@
       </w:r>
       <w:proofErr w:type="spellEnd"/>
       <w:r>
-        <w:t>));</w:t>
-      </w:r>
+        <w:t>)</w:t>
+      </w:r>
+      <w:proofErr w:type="gramStart"/>
+      <w:r>
+        <w:t>);</w:t>
+      </w:r>
+      <w:proofErr w:type="gramEnd"/>
     </w:p>
     <w:p>
       <w:r>
@@ -677,7 +690,7 @@
     <w:p>
       <w:r>
         <w:pict w14:anchorId="6867FE88">
-          <v:rect id="_x0000_i1166" style="width:0;height:1.5pt" o:hralign="center" o:hrstd="t" o:hr="t" fillcolor="#a0a0a0" stroked="f"/>
+          <v:rect id="_x0000_i1028" style="width:0;height:1.5pt" o:hralign="center" o:hrstd="t" o:hr="t" fillcolor="#a0a0a0" stroked="f"/>
         </w:pict>
       </w:r>
     </w:p>
@@ -766,7 +779,7 @@
     <w:p>
       <w:r>
         <w:pict w14:anchorId="789C96E5">
-          <v:rect id="_x0000_i1167" style="width:0;height:1.5pt" o:hralign="center" o:hrstd="t" o:hr="t" fillcolor="#a0a0a0" stroked="f"/>
+          <v:rect id="_x0000_i1029" style="width:0;height:1.5pt" o:hralign="center" o:hrstd="t" o:hr="t" fillcolor="#a0a0a0" stroked="f"/>
         </w:pict>
       </w:r>
     </w:p>
@@ -981,7 +994,7 @@
     <w:p>
       <w:r>
         <w:pict w14:anchorId="2A55DA2F">
-          <v:rect id="_x0000_i1168" style="width:0;height:1.5pt" o:hralign="center" o:hrstd="t" o:hr="t" fillcolor="#a0a0a0" stroked="f"/>
+          <v:rect id="_x0000_i1030" style="width:0;height:1.5pt" o:hralign="center" o:hrstd="t" o:hr="t" fillcolor="#a0a0a0" stroked="f"/>
         </w:pict>
       </w:r>
     </w:p>
@@ -1043,8 +1056,13 @@
       </w:r>
       <w:proofErr w:type="spellEnd"/>
       <w:r>
-        <w:t>, signer);</w:t>
-      </w:r>
+        <w:t>, signer</w:t>
+      </w:r>
+      <w:proofErr w:type="gramStart"/>
+      <w:r>
+        <w:t>);</w:t>
+      </w:r>
+      <w:proofErr w:type="gramEnd"/>
     </w:p>
     <w:p>
       <w:r>
@@ -1078,7 +1096,7 @@
     <w:p>
       <w:r>
         <w:pict w14:anchorId="3AA014D1">
-          <v:rect id="_x0000_i1169" style="width:0;height:1.5pt" o:hralign="center" o:hrstd="t" o:hr="t" fillcolor="#a0a0a0" stroked="f"/>
+          <v:rect id="_x0000_i1031" style="width:0;height:1.5pt" o:hralign="center" o:hrstd="t" o:hr="t" fillcolor="#a0a0a0" stroked="f"/>
         </w:pict>
       </w:r>
     </w:p>
@@ -1151,7 +1169,7 @@
     <w:p>
       <w:r>
         <w:pict w14:anchorId="2A4B644D">
-          <v:rect id="_x0000_i1170" style="width:0;height:1.5pt" o:hralign="center" o:hrstd="t" o:hr="t" fillcolor="#a0a0a0" stroked="f"/>
+          <v:rect id="_x0000_i1032" style="width:0;height:1.5pt" o:hralign="center" o:hrstd="t" o:hr="t" fillcolor="#a0a0a0" stroked="f"/>
         </w:pict>
       </w:r>
     </w:p>
@@ -1294,7 +1312,7 @@
     <w:p>
       <w:r>
         <w:pict w14:anchorId="2953B7AA">
-          <v:rect id="_x0000_i1171" style="width:0;height:1.5pt" o:hralign="center" o:hrstd="t" o:hr="t" fillcolor="#a0a0a0" stroked="f"/>
+          <v:rect id="_x0000_i1033" style="width:0;height:1.5pt" o:hralign="center" o:hrstd="t" o:hr="t" fillcolor="#a0a0a0" stroked="f"/>
         </w:pict>
       </w:r>
     </w:p>
@@ -1415,7 +1433,7 @@
     <w:p>
       <w:r>
         <w:pict w14:anchorId="0BB9B87F">
-          <v:rect id="_x0000_i1172" style="width:0;height:1.5pt" o:hralign="center" o:hrstd="t" o:hr="t" fillcolor="#a0a0a0" stroked="f"/>
+          <v:rect id="_x0000_i1034" style="width:0;height:1.5pt" o:hralign="center" o:hrstd="t" o:hr="t" fillcolor="#a0a0a0" stroked="f"/>
         </w:pict>
       </w:r>
     </w:p>
@@ -1531,7 +1549,7 @@
     <w:p>
       <w:r>
         <w:pict w14:anchorId="6EE79B67">
-          <v:rect id="_x0000_i1173" style="width:0;height:1.5pt" o:hralign="center" o:hrstd="t" o:hr="t" fillcolor="#a0a0a0" stroked="f"/>
+          <v:rect id="_x0000_i1035" style="width:0;height:1.5pt" o:hralign="center" o:hrstd="t" o:hr="t" fillcolor="#a0a0a0" stroked="f"/>
         </w:pict>
       </w:r>
     </w:p>
@@ -1661,7 +1679,7 @@
     <w:p>
       <w:r>
         <w:pict w14:anchorId="4641B242">
-          <v:rect id="_x0000_i1174" style="width:0;height:1.5pt" o:hralign="center" o:hrstd="t" o:hr="t" fillcolor="#a0a0a0" stroked="f"/>
+          <v:rect id="_x0000_i1036" style="width:0;height:1.5pt" o:hralign="center" o:hrstd="t" o:hr="t" fillcolor="#a0a0a0" stroked="f"/>
         </w:pict>
       </w:r>
     </w:p>
@@ -1713,7 +1731,7 @@
     <w:p>
       <w:r>
         <w:pict w14:anchorId="616060EC">
-          <v:rect id="_x0000_i1175" style="width:0;height:1.5pt" o:hralign="center" o:hrstd="t" o:hr="t" fillcolor="#a0a0a0" stroked="f"/>
+          <v:rect id="_x0000_i1037" style="width:0;height:1.5pt" o:hralign="center" o:hrstd="t" o:hr="t" fillcolor="#a0a0a0" stroked="f"/>
         </w:pict>
       </w:r>
     </w:p>
@@ -1765,7 +1783,7 @@
     <w:p>
       <w:r>
         <w:pict w14:anchorId="49731A7F">
-          <v:rect id="_x0000_i1176" style="width:0;height:1.5pt" o:hralign="center" o:hrstd="t" o:hr="t" fillcolor="#a0a0a0" stroked="f"/>
+          <v:rect id="_x0000_i1038" style="width:0;height:1.5pt" o:hralign="center" o:hrstd="t" o:hr="t" fillcolor="#a0a0a0" stroked="f"/>
         </w:pict>
       </w:r>
     </w:p>
@@ -1839,7 +1857,7 @@
     <w:p>
       <w:r>
         <w:pict w14:anchorId="5FCC4F07">
-          <v:rect id="_x0000_i1177" style="width:0;height:1.5pt" o:hralign="center" o:hrstd="t" o:hr="t" fillcolor="#a0a0a0" stroked="f"/>
+          <v:rect id="_x0000_i1039" style="width:0;height:1.5pt" o:hralign="center" o:hrstd="t" o:hr="t" fillcolor="#a0a0a0" stroked="f"/>
         </w:pict>
       </w:r>
     </w:p>
@@ -1943,7 +1961,7 @@
     <w:p>
       <w:r>
         <w:pict w14:anchorId="3C00B807">
-          <v:rect id="_x0000_i1178" style="width:0;height:1.5pt" o:hralign="center" o:hrstd="t" o:hr="t" fillcolor="#a0a0a0" stroked="f"/>
+          <v:rect id="_x0000_i1040" style="width:0;height:1.5pt" o:hralign="center" o:hrstd="t" o:hr="t" fillcolor="#a0a0a0" stroked="f"/>
         </w:pict>
       </w:r>
     </w:p>
@@ -1978,7 +1996,7 @@
     <w:p>
       <w:r>
         <w:pict w14:anchorId="02A0C162">
-          <v:rect id="_x0000_i1179" style="width:0;height:1.5pt" o:hralign="center" o:hrstd="t" o:hr="t" fillcolor="#a0a0a0" stroked="f"/>
+          <v:rect id="_x0000_i1041" style="width:0;height:1.5pt" o:hralign="center" o:hrstd="t" o:hr="t" fillcolor="#a0a0a0" stroked="f"/>
         </w:pict>
       </w:r>
     </w:p>
@@ -2018,7 +2036,7 @@
     <w:p>
       <w:r>
         <w:pict w14:anchorId="6C278219">
-          <v:rect id="_x0000_i1180" style="width:0;height:1.5pt" o:hralign="center" o:hrstd="t" o:hr="t" fillcolor="#a0a0a0" stroked="f"/>
+          <v:rect id="_x0000_i1042" style="width:0;height:1.5pt" o:hralign="center" o:hrstd="t" o:hr="t" fillcolor="#a0a0a0" stroked="f"/>
         </w:pict>
       </w:r>
     </w:p>
@@ -2081,7 +2099,7 @@
     <w:p>
       <w:r>
         <w:pict w14:anchorId="42B6ED73">
-          <v:rect id="_x0000_i1181" style="width:0;height:1.5pt" o:hralign="center" o:hrstd="t" o:hr="t" fillcolor="#a0a0a0" stroked="f"/>
+          <v:rect id="_x0000_i1043" style="width:0;height:1.5pt" o:hralign="center" o:hrstd="t" o:hr="t" fillcolor="#a0a0a0" stroked="f"/>
         </w:pict>
       </w:r>
     </w:p>
@@ -2138,7 +2156,7 @@
     <w:p>
       <w:r>
         <w:pict w14:anchorId="7EC022A0">
-          <v:rect id="_x0000_i1182" style="width:0;height:1.5pt" o:hralign="center" o:hrstd="t" o:hr="t" fillcolor="#a0a0a0" stroked="f"/>
+          <v:rect id="_x0000_i1044" style="width:0;height:1.5pt" o:hralign="center" o:hrstd="t" o:hr="t" fillcolor="#a0a0a0" stroked="f"/>
         </w:pict>
       </w:r>
     </w:p>
@@ -2258,7 +2276,7 @@
     <w:p>
       <w:r>
         <w:pict w14:anchorId="2BFD49C4">
-          <v:rect id="_x0000_i1183" style="width:0;height:1.5pt" o:hralign="center" o:hrstd="t" o:hr="t" fillcolor="#a0a0a0" stroked="f"/>
+          <v:rect id="_x0000_i1045" style="width:0;height:1.5pt" o:hralign="center" o:hrstd="t" o:hr="t" fillcolor="#a0a0a0" stroked="f"/>
         </w:pict>
       </w:r>
     </w:p>
@@ -2303,13 +2321,18 @@
       </w:r>
       <w:proofErr w:type="spellEnd"/>
       <w:r>
-        <w:t xml:space="preserve"> id, address from, address to);</w:t>
-      </w:r>
+        <w:t xml:space="preserve"> id, address from, address to</w:t>
+      </w:r>
+      <w:proofErr w:type="gramStart"/>
+      <w:r>
+        <w:t>);</w:t>
+      </w:r>
+      <w:proofErr w:type="gramEnd"/>
     </w:p>
     <w:p>
       <w:r>
         <w:pict w14:anchorId="2F039E93">
-          <v:rect id="_x0000_i1184" style="width:0;height:1.5pt" o:hralign="center" o:hrstd="t" o:hr="t" fillcolor="#a0a0a0" stroked="f"/>
+          <v:rect id="_x0000_i1046" style="width:0;height:1.5pt" o:hralign="center" o:hrstd="t" o:hr="t" fillcolor="#a0a0a0" stroked="f"/>
         </w:pict>
       </w:r>
     </w:p>
@@ -2388,7 +2411,7 @@
     <w:p>
       <w:r>
         <w:pict w14:anchorId="38E733FC">
-          <v:rect id="_x0000_i1185" style="width:0;height:1.5pt" o:hralign="center" o:hrstd="t" o:hr="t" fillcolor="#a0a0a0" stroked="f"/>
+          <v:rect id="_x0000_i1047" style="width:0;height:1.5pt" o:hralign="center" o:hrstd="t" o:hr="t" fillcolor="#a0a0a0" stroked="f"/>
         </w:pict>
       </w:r>
     </w:p>
@@ -6576,6 +6599,7 @@
   <w:style w:type="character" w:default="1" w:styleId="DefaultParagraphFont">
     <w:name w:val="Default Paragraph Font"/>
     <w:uiPriority w:val="1"/>
+    <w:semiHidden/>
     <w:unhideWhenUsed/>
   </w:style>
   <w:style w:type="table" w:default="1" w:styleId="TableNormal">

</xml_diff>